<commit_message>
Give QSR Tables 5–10 one column per protocol family.
Existing Stage/Section values are dropped on open/export; URS identity and Remarks stay, and DQ/IQ/OQ/PQ start blank so the assistant can refill each protocol (NA if searched and not found).

Co-authored-by: sachin.agrawal272 <sachin.agrawal272@gmail.com>
</commit_message>
<xml_diff>
--- a/templates/3xper-qualification-summary-report-template.docx
+++ b/templates/3xper-qualification-summary-report-template.docx
@@ -6848,8 +6848,10 @@
         <w:gridCol w:w="1190"/>
         <w:gridCol w:w="1675"/>
         <w:gridCol w:w="3515"/>
-        <w:gridCol w:w="2047"/>
-        <w:gridCol w:w="2964"/>
+        <w:gridCol w:w="1252"/>
+        <w:gridCol w:w="1252"/>
+        <w:gridCol w:w="1252"/>
+        <w:gridCol w:w="1255"/>
         <w:gridCol w:w="2469"/>
       </w:tblGrid>
       <w:tr>
@@ -6955,7 +6957,7 @@
         <w:tc>
           <w:tcPr>
             <w:tcW w:w="5011" w:type="dxa"/>
-            <w:gridSpan w:val="2"/>
+            <w:gridSpan w:val="4"/>
             <w:tcBorders>
               <w:top w:val="single" w:sz="2" w:space="0" w:color="000000"/>
               <w:left w:val="single" w:sz="2" w:space="0" w:color="000000"/>
@@ -7096,7 +7098,7 @@
         </w:tc>
         <w:tc>
           <w:tcPr>
-            <w:tcW w:w="2047" w:type="dxa"/>
+            <w:tcW w:w="1252" w:type="dxa"/>
             <w:tcBorders>
               <w:top w:val="single" w:sz="2" w:space="0" w:color="000000"/>
               <w:left w:val="single" w:sz="2" w:space="0" w:color="000000"/>
@@ -7124,13 +7126,13 @@
                 <w:bCs/>
                 <w:sz w:val="26"/>
               </w:rPr>
-              <w:t>Qualification Stage</w:t>
-            </w:r>
-          </w:p>
-        </w:tc>
-        <w:tc>
-          <w:tcPr>
-            <w:tcW w:w="2964" w:type="dxa"/>
+              <w:t xml:space="preserve">DQ</w:t>
+            </w:r>
+          </w:p>
+        </w:tc>
+        <w:tc>
+          <w:tcPr>
+            <w:tcW w:w="1252" w:type="dxa"/>
             <w:tcBorders>
               <w:top w:val="single" w:sz="2" w:space="0" w:color="000000"/>
               <w:left w:val="single" w:sz="2" w:space="0" w:color="000000"/>
@@ -7158,7 +7160,75 @@
                 <w:bCs/>
                 <w:sz w:val="26"/>
               </w:rPr>
-              <w:t>Section</w:t>
+              <w:t xml:space="preserve">IQ</w:t>
+            </w:r>
+          </w:p>
+        </w:tc>
+        <w:tc>
+          <w:tcPr>
+            <w:tcW w:w="1252" w:type="dxa"/>
+            <w:tcBorders>
+              <w:top w:val="single" w:sz="2" w:space="0" w:color="000000"/>
+              <w:left w:val="single" w:sz="2" w:space="0" w:color="000000"/>
+              <w:bottom w:val="single" w:sz="2" w:space="0" w:color="000000"/>
+              <w:right w:val="single" w:sz="2" w:space="0" w:color="000000"/>
+            </w:tcBorders>
+            <w:shd w:val="clear" w:color="auto" w:fill="FFD966"/>
+            <w:vAlign w:val="center"/>
+          </w:tcPr>
+          <w:p>
+            <w:pPr>
+              <w:ind w:right="51"/>
+              <w:jc w:val="center"/>
+              <w:rPr>
+                <w:rFonts w:ascii="Times New Roman" w:eastAsia="Times New Roman" w:hAnsi="Times New Roman" w:cs="Times New Roman"/>
+                <w:b/>
+                <w:bCs/>
+                <w:sz w:val="26"/>
+              </w:rPr>
+            </w:pPr>
+            <w:r>
+              <w:rPr>
+                <w:rFonts w:ascii="Times New Roman" w:eastAsia="Times New Roman" w:hAnsi="Times New Roman" w:cs="Times New Roman"/>
+                <w:b/>
+                <w:bCs/>
+                <w:sz w:val="26"/>
+              </w:rPr>
+              <w:t xml:space="preserve">OQ</w:t>
+            </w:r>
+          </w:p>
+        </w:tc>
+        <w:tc>
+          <w:tcPr>
+            <w:tcW w:w="1255" w:type="dxa"/>
+            <w:tcBorders>
+              <w:top w:val="single" w:sz="2" w:space="0" w:color="000000"/>
+              <w:left w:val="single" w:sz="2" w:space="0" w:color="000000"/>
+              <w:bottom w:val="single" w:sz="2" w:space="0" w:color="000000"/>
+              <w:right w:val="single" w:sz="2" w:space="0" w:color="000000"/>
+            </w:tcBorders>
+            <w:shd w:val="clear" w:color="auto" w:fill="FFD966"/>
+            <w:vAlign w:val="center"/>
+          </w:tcPr>
+          <w:p>
+            <w:pPr>
+              <w:ind w:right="51"/>
+              <w:jc w:val="center"/>
+              <w:rPr>
+                <w:rFonts w:ascii="Times New Roman" w:eastAsia="Times New Roman" w:hAnsi="Times New Roman" w:cs="Times New Roman"/>
+                <w:b/>
+                <w:bCs/>
+                <w:sz w:val="26"/>
+              </w:rPr>
+            </w:pPr>
+            <w:r>
+              <w:rPr>
+                <w:rFonts w:ascii="Times New Roman" w:eastAsia="Times New Roman" w:hAnsi="Times New Roman" w:cs="Times New Roman"/>
+                <w:b/>
+                <w:bCs/>
+                <w:sz w:val="26"/>
+              </w:rPr>
+              <w:t xml:space="preserve">PQ</w:t>
             </w:r>
           </w:p>
         </w:tc>
@@ -7268,7 +7338,7 @@
         </w:tc>
         <w:tc>
           <w:tcPr>
-            <w:tcW w:w="2047" w:type="dxa"/>
+            <w:tcW w:w="1252" w:type="dxa"/>
             <w:tcBorders>
               <w:top w:val="single" w:sz="2" w:space="0" w:color="000000"/>
               <w:left w:val="single" w:sz="2" w:space="0" w:color="000000"/>
@@ -7294,7 +7364,7 @@
         </w:tc>
         <w:tc>
           <w:tcPr>
-            <w:tcW w:w="2964" w:type="dxa"/>
+            <w:tcW w:w="1252" w:type="dxa"/>
             <w:tcBorders>
               <w:top w:val="single" w:sz="2" w:space="0" w:color="000000"/>
               <w:left w:val="single" w:sz="2" w:space="0" w:color="000000"/>
@@ -7304,7 +7374,58 @@
           </w:tcPr>
           <w:p>
             <w:pPr>
-              <w:ind w:left="23"/>
+              <w:rPr>
+                <w:rFonts w:ascii="Times New Roman" w:eastAsia="Times New Roman" w:hAnsi="Times New Roman" w:cs="Times New Roman"/>
+                <w:sz w:val="24"/>
+              </w:rPr>
+            </w:pPr>
+            <w:r>
+              <w:rPr>
+                <w:rFonts w:ascii="Times New Roman" w:eastAsia="Times New Roman" w:hAnsi="Times New Roman" w:cs="Times New Roman"/>
+                <w:sz w:val="24"/>
+              </w:rPr>
+              <w:t xml:space="preserve"/>
+            </w:r>
+          </w:p>
+        </w:tc>
+        <w:tc>
+          <w:tcPr>
+            <w:tcW w:w="1252" w:type="dxa"/>
+            <w:tcBorders>
+              <w:top w:val="single" w:sz="2" w:space="0" w:color="000000"/>
+              <w:left w:val="single" w:sz="2" w:space="0" w:color="000000"/>
+              <w:bottom w:val="single" w:sz="2" w:space="0" w:color="000000"/>
+              <w:right w:val="single" w:sz="2" w:space="0" w:color="000000"/>
+            </w:tcBorders>
+          </w:tcPr>
+          <w:p>
+            <w:pPr>
+              <w:rPr>
+                <w:rFonts w:ascii="Times New Roman" w:eastAsia="Times New Roman" w:hAnsi="Times New Roman" w:cs="Times New Roman"/>
+                <w:sz w:val="24"/>
+              </w:rPr>
+            </w:pPr>
+            <w:r>
+              <w:rPr>
+                <w:rFonts w:ascii="Times New Roman" w:eastAsia="Times New Roman" w:hAnsi="Times New Roman" w:cs="Times New Roman"/>
+                <w:sz w:val="24"/>
+              </w:rPr>
+              <w:t xml:space="preserve"/>
+            </w:r>
+          </w:p>
+        </w:tc>
+        <w:tc>
+          <w:tcPr>
+            <w:tcW w:w="1255" w:type="dxa"/>
+            <w:tcBorders>
+              <w:top w:val="single" w:sz="2" w:space="0" w:color="000000"/>
+              <w:left w:val="single" w:sz="2" w:space="0" w:color="000000"/>
+              <w:bottom w:val="single" w:sz="2" w:space="0" w:color="000000"/>
+              <w:right w:val="single" w:sz="2" w:space="0" w:color="000000"/>
+            </w:tcBorders>
+          </w:tcPr>
+          <w:p>
+            <w:pPr>
               <w:rPr>
                 <w:rFonts w:ascii="Times New Roman" w:eastAsia="Times New Roman" w:hAnsi="Times New Roman" w:cs="Times New Roman"/>
                 <w:sz w:val="24"/>
@@ -7356,7 +7477,7 @@
         <w:tc>
           <w:tcPr>
             <w:tcW w:w="13860" w:type="dxa"/>
-            <w:gridSpan w:val="6"/>
+            <w:gridSpan w:val="8"/>
             <w:tcBorders>
               <w:top w:val="single" w:sz="2" w:space="0" w:color="000000"/>
               <w:left w:val="single" w:sz="2" w:space="0" w:color="000000"/>
@@ -7462,8 +7583,10 @@
         <w:gridCol w:w="1602"/>
         <w:gridCol w:w="2845"/>
         <w:gridCol w:w="2644"/>
-        <w:gridCol w:w="1668"/>
-        <w:gridCol w:w="2668"/>
+        <w:gridCol w:w="1084"/>
+        <w:gridCol w:w="1084"/>
+        <w:gridCol w:w="1084"/>
+        <w:gridCol w:w="1084"/>
         <w:gridCol w:w="1481"/>
       </w:tblGrid>
       <w:tr>
@@ -7540,7 +7663,7 @@
         <w:tc>
           <w:tcPr>
             <w:tcW w:w="4336" w:type="dxa"/>
-            <w:gridSpan w:val="2"/>
+            <w:gridSpan w:val="4"/>
             <w:tcBorders>
               <w:top w:val="single" w:sz="2" w:space="0" w:color="000000"/>
               <w:left w:val="single" w:sz="4" w:space="0" w:color="auto"/>
@@ -7738,7 +7861,7 @@
         </w:tc>
         <w:tc>
           <w:tcPr>
-            <w:tcW w:w="1668" w:type="dxa"/>
+            <w:tcW w:w="1084" w:type="dxa"/>
             <w:tcBorders>
               <w:top w:val="single" w:sz="2" w:space="0" w:color="000000"/>
               <w:left w:val="single" w:sz="4" w:space="0" w:color="auto"/>
@@ -7766,16 +7889,16 @@
                 <w:bCs/>
                 <w:sz w:val="26"/>
               </w:rPr>
-              <w:t>Qualification Stage</w:t>
-            </w:r>
-          </w:p>
-        </w:tc>
-        <w:tc>
-          <w:tcPr>
-            <w:tcW w:w="2668" w:type="dxa"/>
+              <w:t xml:space="preserve">DQ</w:t>
+            </w:r>
+          </w:p>
+        </w:tc>
+        <w:tc>
+          <w:tcPr>
+            <w:tcW w:w="1084" w:type="dxa"/>
             <w:tcBorders>
               <w:top w:val="single" w:sz="2" w:space="0" w:color="000000"/>
-              <w:left w:val="single" w:sz="2" w:space="0" w:color="000000"/>
+              <w:left w:val="single" w:sz="4" w:space="0" w:color="auto"/>
               <w:bottom w:val="single" w:sz="2" w:space="0" w:color="000000"/>
               <w:right w:val="single" w:sz="2" w:space="0" w:color="000000"/>
             </w:tcBorders>
@@ -7800,7 +7923,75 @@
                 <w:bCs/>
                 <w:sz w:val="26"/>
               </w:rPr>
-              <w:t>Section</w:t>
+              <w:t xml:space="preserve">IQ</w:t>
+            </w:r>
+          </w:p>
+        </w:tc>
+        <w:tc>
+          <w:tcPr>
+            <w:tcW w:w="1084" w:type="dxa"/>
+            <w:tcBorders>
+              <w:top w:val="single" w:sz="2" w:space="0" w:color="000000"/>
+              <w:left w:val="single" w:sz="4" w:space="0" w:color="auto"/>
+              <w:bottom w:val="single" w:sz="2" w:space="0" w:color="000000"/>
+              <w:right w:val="single" w:sz="2" w:space="0" w:color="000000"/>
+            </w:tcBorders>
+            <w:shd w:val="clear" w:color="auto" w:fill="FFD966"/>
+            <w:vAlign w:val="center"/>
+          </w:tcPr>
+          <w:p>
+            <w:pPr>
+              <w:ind w:right="51"/>
+              <w:jc w:val="center"/>
+              <w:rPr>
+                <w:rFonts w:ascii="Times New Roman" w:eastAsia="Times New Roman" w:hAnsi="Times New Roman" w:cs="Times New Roman"/>
+                <w:b/>
+                <w:bCs/>
+                <w:sz w:val="26"/>
+              </w:rPr>
+            </w:pPr>
+            <w:r>
+              <w:rPr>
+                <w:rFonts w:ascii="Times New Roman" w:eastAsia="Times New Roman" w:hAnsi="Times New Roman" w:cs="Times New Roman"/>
+                <w:b/>
+                <w:bCs/>
+                <w:sz w:val="26"/>
+              </w:rPr>
+              <w:t xml:space="preserve">OQ</w:t>
+            </w:r>
+          </w:p>
+        </w:tc>
+        <w:tc>
+          <w:tcPr>
+            <w:tcW w:w="1084" w:type="dxa"/>
+            <w:tcBorders>
+              <w:top w:val="single" w:sz="2" w:space="0" w:color="000000"/>
+              <w:left w:val="single" w:sz="4" w:space="0" w:color="auto"/>
+              <w:bottom w:val="single" w:sz="2" w:space="0" w:color="000000"/>
+              <w:right w:val="single" w:sz="2" w:space="0" w:color="000000"/>
+            </w:tcBorders>
+            <w:shd w:val="clear" w:color="auto" w:fill="FFD966"/>
+            <w:vAlign w:val="center"/>
+          </w:tcPr>
+          <w:p>
+            <w:pPr>
+              <w:ind w:right="51"/>
+              <w:jc w:val="center"/>
+              <w:rPr>
+                <w:rFonts w:ascii="Times New Roman" w:eastAsia="Times New Roman" w:hAnsi="Times New Roman" w:cs="Times New Roman"/>
+                <w:b/>
+                <w:bCs/>
+                <w:sz w:val="26"/>
+              </w:rPr>
+            </w:pPr>
+            <w:r>
+              <w:rPr>
+                <w:rFonts w:ascii="Times New Roman" w:eastAsia="Times New Roman" w:hAnsi="Times New Roman" w:cs="Times New Roman"/>
+                <w:b/>
+                <w:bCs/>
+                <w:sz w:val="26"/>
+              </w:rPr>
+              <w:t xml:space="preserve">PQ</w:t>
             </w:r>
           </w:p>
         </w:tc>
@@ -7937,7 +8128,7 @@
         </w:tc>
         <w:tc>
           <w:tcPr>
-            <w:tcW w:w="1668" w:type="dxa"/>
+            <w:tcW w:w="1084" w:type="dxa"/>
             <w:tcBorders>
               <w:top w:val="single" w:sz="2" w:space="0" w:color="000000"/>
               <w:left w:val="single" w:sz="2" w:space="0" w:color="000000"/>
@@ -7965,13 +8156,70 @@
         </w:tc>
         <w:tc>
           <w:tcPr>
-            <w:tcW w:w="2668" w:type="dxa"/>
+            <w:tcW w:w="1084" w:type="dxa"/>
             <w:tcBorders>
               <w:top w:val="single" w:sz="2" w:space="0" w:color="000000"/>
               <w:left w:val="single" w:sz="2" w:space="0" w:color="000000"/>
               <w:bottom w:val="single" w:sz="2" w:space="0" w:color="000000"/>
               <w:right w:val="single" w:sz="2" w:space="0" w:color="000000"/>
             </w:tcBorders>
+            <w:vAlign w:val="center"/>
+          </w:tcPr>
+          <w:p>
+            <w:pPr>
+              <w:ind w:left="23"/>
+              <w:rPr>
+                <w:rFonts w:ascii="Times New Roman" w:eastAsia="Times New Roman" w:hAnsi="Times New Roman" w:cs="Times New Roman"/>
+                <w:sz w:val="24"/>
+              </w:rPr>
+            </w:pPr>
+            <w:r>
+              <w:rPr>
+                <w:rFonts w:ascii="Times New Roman" w:eastAsia="Times New Roman" w:hAnsi="Times New Roman" w:cs="Times New Roman"/>
+                <w:sz w:val="24"/>
+              </w:rPr>
+              <w:t xml:space="preserve"/>
+            </w:r>
+          </w:p>
+        </w:tc>
+        <w:tc>
+          <w:tcPr>
+            <w:tcW w:w="1084" w:type="dxa"/>
+            <w:tcBorders>
+              <w:top w:val="single" w:sz="2" w:space="0" w:color="000000"/>
+              <w:left w:val="single" w:sz="2" w:space="0" w:color="000000"/>
+              <w:bottom w:val="single" w:sz="2" w:space="0" w:color="000000"/>
+              <w:right w:val="single" w:sz="2" w:space="0" w:color="000000"/>
+            </w:tcBorders>
+            <w:vAlign w:val="center"/>
+          </w:tcPr>
+          <w:p>
+            <w:pPr>
+              <w:ind w:left="23"/>
+              <w:rPr>
+                <w:rFonts w:ascii="Times New Roman" w:eastAsia="Times New Roman" w:hAnsi="Times New Roman" w:cs="Times New Roman"/>
+                <w:sz w:val="24"/>
+              </w:rPr>
+            </w:pPr>
+            <w:r>
+              <w:rPr>
+                <w:rFonts w:ascii="Times New Roman" w:eastAsia="Times New Roman" w:hAnsi="Times New Roman" w:cs="Times New Roman"/>
+                <w:sz w:val="24"/>
+              </w:rPr>
+              <w:t xml:space="preserve"/>
+            </w:r>
+          </w:p>
+        </w:tc>
+        <w:tc>
+          <w:tcPr>
+            <w:tcW w:w="1084" w:type="dxa"/>
+            <w:tcBorders>
+              <w:top w:val="single" w:sz="2" w:space="0" w:color="000000"/>
+              <w:left w:val="single" w:sz="2" w:space="0" w:color="000000"/>
+              <w:bottom w:val="single" w:sz="2" w:space="0" w:color="000000"/>
+              <w:right w:val="single" w:sz="2" w:space="0" w:color="000000"/>
+            </w:tcBorders>
+            <w:vAlign w:val="center"/>
           </w:tcPr>
           <w:p>
             <w:pPr>
@@ -8111,8 +8359,10 @@
         <w:gridCol w:w="1210"/>
         <w:gridCol w:w="1685"/>
         <w:gridCol w:w="3573"/>
-        <w:gridCol w:w="2068"/>
-        <w:gridCol w:w="3005"/>
+        <w:gridCol w:w="1268"/>
+        <w:gridCol w:w="1268"/>
+        <w:gridCol w:w="1268"/>
+        <w:gridCol w:w="1269"/>
         <w:gridCol w:w="2319"/>
       </w:tblGrid>
       <w:tr>
@@ -8218,7 +8468,7 @@
         <w:tc>
           <w:tcPr>
             <w:tcW w:w="5073" w:type="dxa"/>
-            <w:gridSpan w:val="2"/>
+            <w:gridSpan w:val="4"/>
             <w:tcBorders>
               <w:top w:val="single" w:sz="2" w:space="0" w:color="000000"/>
               <w:left w:val="single" w:sz="2" w:space="0" w:color="000000"/>
@@ -8359,7 +8609,7 @@
         </w:tc>
         <w:tc>
           <w:tcPr>
-            <w:tcW w:w="2068" w:type="dxa"/>
+            <w:tcW w:w="1268" w:type="dxa"/>
             <w:tcBorders>
               <w:top w:val="single" w:sz="2" w:space="0" w:color="000000"/>
               <w:left w:val="single" w:sz="2" w:space="0" w:color="000000"/>
@@ -8387,13 +8637,13 @@
                 <w:bCs/>
                 <w:sz w:val="26"/>
               </w:rPr>
-              <w:t>Qualification Stage</w:t>
-            </w:r>
-          </w:p>
-        </w:tc>
-        <w:tc>
-          <w:tcPr>
-            <w:tcW w:w="3005" w:type="dxa"/>
+              <w:t xml:space="preserve">DQ</w:t>
+            </w:r>
+          </w:p>
+        </w:tc>
+        <w:tc>
+          <w:tcPr>
+            <w:tcW w:w="1268" w:type="dxa"/>
             <w:tcBorders>
               <w:top w:val="single" w:sz="2" w:space="0" w:color="000000"/>
               <w:left w:val="single" w:sz="2" w:space="0" w:color="000000"/>
@@ -8421,7 +8671,75 @@
                 <w:bCs/>
                 <w:sz w:val="26"/>
               </w:rPr>
-              <w:t>Section</w:t>
+              <w:t xml:space="preserve">IQ</w:t>
+            </w:r>
+          </w:p>
+        </w:tc>
+        <w:tc>
+          <w:tcPr>
+            <w:tcW w:w="1268" w:type="dxa"/>
+            <w:tcBorders>
+              <w:top w:val="single" w:sz="2" w:space="0" w:color="000000"/>
+              <w:left w:val="single" w:sz="2" w:space="0" w:color="000000"/>
+              <w:bottom w:val="single" w:sz="2" w:space="0" w:color="000000"/>
+              <w:right w:val="single" w:sz="2" w:space="0" w:color="000000"/>
+            </w:tcBorders>
+            <w:shd w:val="clear" w:color="auto" w:fill="FFD966"/>
+            <w:vAlign w:val="center"/>
+          </w:tcPr>
+          <w:p>
+            <w:pPr>
+              <w:ind w:right="51"/>
+              <w:jc w:val="center"/>
+              <w:rPr>
+                <w:rFonts w:ascii="Times New Roman" w:eastAsia="Times New Roman" w:hAnsi="Times New Roman" w:cs="Times New Roman"/>
+                <w:b/>
+                <w:bCs/>
+                <w:sz w:val="26"/>
+              </w:rPr>
+            </w:pPr>
+            <w:r>
+              <w:rPr>
+                <w:rFonts w:ascii="Times New Roman" w:eastAsia="Times New Roman" w:hAnsi="Times New Roman" w:cs="Times New Roman"/>
+                <w:b/>
+                <w:bCs/>
+                <w:sz w:val="26"/>
+              </w:rPr>
+              <w:t xml:space="preserve">OQ</w:t>
+            </w:r>
+          </w:p>
+        </w:tc>
+        <w:tc>
+          <w:tcPr>
+            <w:tcW w:w="1269" w:type="dxa"/>
+            <w:tcBorders>
+              <w:top w:val="single" w:sz="2" w:space="0" w:color="000000"/>
+              <w:left w:val="single" w:sz="2" w:space="0" w:color="000000"/>
+              <w:bottom w:val="single" w:sz="2" w:space="0" w:color="000000"/>
+              <w:right w:val="single" w:sz="2" w:space="0" w:color="000000"/>
+            </w:tcBorders>
+            <w:shd w:val="clear" w:color="auto" w:fill="FFD966"/>
+            <w:vAlign w:val="center"/>
+          </w:tcPr>
+          <w:p>
+            <w:pPr>
+              <w:ind w:right="51"/>
+              <w:jc w:val="center"/>
+              <w:rPr>
+                <w:rFonts w:ascii="Times New Roman" w:eastAsia="Times New Roman" w:hAnsi="Times New Roman" w:cs="Times New Roman"/>
+                <w:b/>
+                <w:bCs/>
+                <w:sz w:val="26"/>
+              </w:rPr>
+            </w:pPr>
+            <w:r>
+              <w:rPr>
+                <w:rFonts w:ascii="Times New Roman" w:eastAsia="Times New Roman" w:hAnsi="Times New Roman" w:cs="Times New Roman"/>
+                <w:b/>
+                <w:bCs/>
+                <w:sz w:val="26"/>
+              </w:rPr>
+              <w:t xml:space="preserve">PQ</w:t>
             </w:r>
           </w:p>
         </w:tc>
@@ -8530,7 +8848,7 @@
         </w:tc>
         <w:tc>
           <w:tcPr>
-            <w:tcW w:w="2068" w:type="dxa"/>
+            <w:tcW w:w="1268" w:type="dxa"/>
             <w:tcBorders>
               <w:top w:val="single" w:sz="2" w:space="0" w:color="000000"/>
               <w:left w:val="single" w:sz="2" w:space="0" w:color="000000"/>
@@ -8557,7 +8875,61 @@
         </w:tc>
         <w:tc>
           <w:tcPr>
-            <w:tcW w:w="3005" w:type="dxa"/>
+            <w:tcW w:w="1268" w:type="dxa"/>
+            <w:tcBorders>
+              <w:top w:val="single" w:sz="2" w:space="0" w:color="000000"/>
+              <w:left w:val="single" w:sz="2" w:space="0" w:color="000000"/>
+              <w:bottom w:val="single" w:sz="2" w:space="0" w:color="000000"/>
+              <w:right w:val="single" w:sz="2" w:space="0" w:color="000000"/>
+            </w:tcBorders>
+          </w:tcPr>
+          <w:p>
+            <w:pPr>
+              <w:ind w:left="23"/>
+              <w:rPr>
+                <w:rFonts w:ascii="Times New Roman" w:eastAsia="Times New Roman" w:hAnsi="Times New Roman" w:cs="Times New Roman"/>
+                <w:sz w:val="24"/>
+              </w:rPr>
+            </w:pPr>
+            <w:r>
+              <w:rPr>
+                <w:rFonts w:ascii="Times New Roman" w:eastAsia="Times New Roman" w:hAnsi="Times New Roman" w:cs="Times New Roman"/>
+                <w:sz w:val="24"/>
+              </w:rPr>
+              <w:t xml:space="preserve"/>
+            </w:r>
+          </w:p>
+        </w:tc>
+        <w:tc>
+          <w:tcPr>
+            <w:tcW w:w="1268" w:type="dxa"/>
+            <w:tcBorders>
+              <w:top w:val="single" w:sz="2" w:space="0" w:color="000000"/>
+              <w:left w:val="single" w:sz="2" w:space="0" w:color="000000"/>
+              <w:bottom w:val="single" w:sz="2" w:space="0" w:color="000000"/>
+              <w:right w:val="single" w:sz="2" w:space="0" w:color="000000"/>
+            </w:tcBorders>
+          </w:tcPr>
+          <w:p>
+            <w:pPr>
+              <w:ind w:left="23"/>
+              <w:rPr>
+                <w:rFonts w:ascii="Times New Roman" w:eastAsia="Times New Roman" w:hAnsi="Times New Roman" w:cs="Times New Roman"/>
+                <w:sz w:val="24"/>
+              </w:rPr>
+            </w:pPr>
+            <w:r>
+              <w:rPr>
+                <w:rFonts w:ascii="Times New Roman" w:eastAsia="Times New Roman" w:hAnsi="Times New Roman" w:cs="Times New Roman"/>
+                <w:sz w:val="24"/>
+              </w:rPr>
+              <w:t xml:space="preserve"/>
+            </w:r>
+          </w:p>
+        </w:tc>
+        <w:tc>
+          <w:tcPr>
+            <w:tcW w:w="1269" w:type="dxa"/>
             <w:tcBorders>
               <w:top w:val="single" w:sz="2" w:space="0" w:color="000000"/>
               <w:left w:val="single" w:sz="2" w:space="0" w:color="000000"/>
@@ -8705,8 +9077,10 @@
         <w:gridCol w:w="1210"/>
         <w:gridCol w:w="1685"/>
         <w:gridCol w:w="3573"/>
-        <w:gridCol w:w="2068"/>
-        <w:gridCol w:w="3005"/>
+        <w:gridCol w:w="1268"/>
+        <w:gridCol w:w="1268"/>
+        <w:gridCol w:w="1268"/>
+        <w:gridCol w:w="1269"/>
         <w:gridCol w:w="2319"/>
       </w:tblGrid>
       <w:tr>
@@ -8813,7 +9187,7 @@
         <w:tc>
           <w:tcPr>
             <w:tcW w:w="5073" w:type="dxa"/>
-            <w:gridSpan w:val="2"/>
+            <w:gridSpan w:val="4"/>
             <w:tcBorders>
               <w:top w:val="single" w:sz="2" w:space="0" w:color="000000"/>
               <w:left w:val="single" w:sz="2" w:space="0" w:color="000000"/>
@@ -8954,7 +9328,7 @@
         </w:tc>
         <w:tc>
           <w:tcPr>
-            <w:tcW w:w="2068" w:type="dxa"/>
+            <w:tcW w:w="1268" w:type="dxa"/>
             <w:tcBorders>
               <w:top w:val="single" w:sz="2" w:space="0" w:color="000000"/>
               <w:left w:val="single" w:sz="2" w:space="0" w:color="000000"/>
@@ -8982,13 +9356,13 @@
                 <w:bCs/>
                 <w:sz w:val="26"/>
               </w:rPr>
-              <w:t>Qualification Stage</w:t>
-            </w:r>
-          </w:p>
-        </w:tc>
-        <w:tc>
-          <w:tcPr>
-            <w:tcW w:w="3005" w:type="dxa"/>
+              <w:t xml:space="preserve">DQ</w:t>
+            </w:r>
+          </w:p>
+        </w:tc>
+        <w:tc>
+          <w:tcPr>
+            <w:tcW w:w="1268" w:type="dxa"/>
             <w:tcBorders>
               <w:top w:val="single" w:sz="2" w:space="0" w:color="000000"/>
               <w:left w:val="single" w:sz="2" w:space="0" w:color="000000"/>
@@ -9016,7 +9390,75 @@
                 <w:bCs/>
                 <w:sz w:val="26"/>
               </w:rPr>
-              <w:t>Section</w:t>
+              <w:t xml:space="preserve">IQ</w:t>
+            </w:r>
+          </w:p>
+        </w:tc>
+        <w:tc>
+          <w:tcPr>
+            <w:tcW w:w="1268" w:type="dxa"/>
+            <w:tcBorders>
+              <w:top w:val="single" w:sz="2" w:space="0" w:color="000000"/>
+              <w:left w:val="single" w:sz="2" w:space="0" w:color="000000"/>
+              <w:bottom w:val="single" w:sz="2" w:space="0" w:color="000000"/>
+              <w:right w:val="single" w:sz="2" w:space="0" w:color="000000"/>
+            </w:tcBorders>
+            <w:shd w:val="clear" w:color="auto" w:fill="FFD966"/>
+            <w:vAlign w:val="center"/>
+          </w:tcPr>
+          <w:p>
+            <w:pPr>
+              <w:ind w:right="51"/>
+              <w:jc w:val="center"/>
+              <w:rPr>
+                <w:rFonts w:ascii="Times New Roman" w:eastAsia="Times New Roman" w:hAnsi="Times New Roman" w:cs="Times New Roman"/>
+                <w:b/>
+                <w:bCs/>
+                <w:sz w:val="26"/>
+              </w:rPr>
+            </w:pPr>
+            <w:r>
+              <w:rPr>
+                <w:rFonts w:ascii="Times New Roman" w:eastAsia="Times New Roman" w:hAnsi="Times New Roman" w:cs="Times New Roman"/>
+                <w:b/>
+                <w:bCs/>
+                <w:sz w:val="26"/>
+              </w:rPr>
+              <w:t xml:space="preserve">OQ</w:t>
+            </w:r>
+          </w:p>
+        </w:tc>
+        <w:tc>
+          <w:tcPr>
+            <w:tcW w:w="1269" w:type="dxa"/>
+            <w:tcBorders>
+              <w:top w:val="single" w:sz="2" w:space="0" w:color="000000"/>
+              <w:left w:val="single" w:sz="2" w:space="0" w:color="000000"/>
+              <w:bottom w:val="single" w:sz="2" w:space="0" w:color="000000"/>
+              <w:right w:val="single" w:sz="2" w:space="0" w:color="000000"/>
+            </w:tcBorders>
+            <w:shd w:val="clear" w:color="auto" w:fill="FFD966"/>
+            <w:vAlign w:val="center"/>
+          </w:tcPr>
+          <w:p>
+            <w:pPr>
+              <w:ind w:right="51"/>
+              <w:jc w:val="center"/>
+              <w:rPr>
+                <w:rFonts w:ascii="Times New Roman" w:eastAsia="Times New Roman" w:hAnsi="Times New Roman" w:cs="Times New Roman"/>
+                <w:b/>
+                <w:bCs/>
+                <w:sz w:val="26"/>
+              </w:rPr>
+            </w:pPr>
+            <w:r>
+              <w:rPr>
+                <w:rFonts w:ascii="Times New Roman" w:eastAsia="Times New Roman" w:hAnsi="Times New Roman" w:cs="Times New Roman"/>
+                <w:b/>
+                <w:bCs/>
+                <w:sz w:val="26"/>
+              </w:rPr>
+              <w:t xml:space="preserve">PQ</w:t>
             </w:r>
           </w:p>
         </w:tc>
@@ -9124,7 +9566,7 @@
         </w:tc>
         <w:tc>
           <w:tcPr>
-            <w:tcW w:w="2068" w:type="dxa"/>
+            <w:tcW w:w="1268" w:type="dxa"/>
             <w:tcBorders>
               <w:top w:val="single" w:sz="2" w:space="0" w:color="000000"/>
               <w:left w:val="single" w:sz="2" w:space="0" w:color="000000"/>
@@ -9151,7 +9593,61 @@
         </w:tc>
         <w:tc>
           <w:tcPr>
-            <w:tcW w:w="3005" w:type="dxa"/>
+            <w:tcW w:w="1268" w:type="dxa"/>
+            <w:tcBorders>
+              <w:top w:val="single" w:sz="2" w:space="0" w:color="000000"/>
+              <w:left w:val="single" w:sz="2" w:space="0" w:color="000000"/>
+              <w:bottom w:val="single" w:sz="2" w:space="0" w:color="000000"/>
+              <w:right w:val="single" w:sz="2" w:space="0" w:color="000000"/>
+            </w:tcBorders>
+          </w:tcPr>
+          <w:p>
+            <w:pPr>
+              <w:ind w:left="23"/>
+              <w:rPr>
+                <w:rFonts w:ascii="Times New Roman" w:eastAsia="Times New Roman" w:hAnsi="Times New Roman" w:cs="Times New Roman"/>
+                <w:sz w:val="24"/>
+              </w:rPr>
+            </w:pPr>
+            <w:r>
+              <w:rPr>
+                <w:rFonts w:ascii="Times New Roman" w:eastAsia="Times New Roman" w:hAnsi="Times New Roman" w:cs="Times New Roman"/>
+                <w:sz w:val="24"/>
+              </w:rPr>
+              <w:t xml:space="preserve"/>
+            </w:r>
+          </w:p>
+        </w:tc>
+        <w:tc>
+          <w:tcPr>
+            <w:tcW w:w="1268" w:type="dxa"/>
+            <w:tcBorders>
+              <w:top w:val="single" w:sz="2" w:space="0" w:color="000000"/>
+              <w:left w:val="single" w:sz="2" w:space="0" w:color="000000"/>
+              <w:bottom w:val="single" w:sz="2" w:space="0" w:color="000000"/>
+              <w:right w:val="single" w:sz="2" w:space="0" w:color="000000"/>
+            </w:tcBorders>
+          </w:tcPr>
+          <w:p>
+            <w:pPr>
+              <w:ind w:left="23"/>
+              <w:rPr>
+                <w:rFonts w:ascii="Times New Roman" w:eastAsia="Times New Roman" w:hAnsi="Times New Roman" w:cs="Times New Roman"/>
+                <w:sz w:val="24"/>
+              </w:rPr>
+            </w:pPr>
+            <w:r>
+              <w:rPr>
+                <w:rFonts w:ascii="Times New Roman" w:eastAsia="Times New Roman" w:hAnsi="Times New Roman" w:cs="Times New Roman"/>
+                <w:sz w:val="24"/>
+              </w:rPr>
+              <w:t xml:space="preserve"/>
+            </w:r>
+          </w:p>
+        </w:tc>
+        <w:tc>
+          <w:tcPr>
+            <w:tcW w:w="1269" w:type="dxa"/>
             <w:tcBorders>
               <w:top w:val="single" w:sz="2" w:space="0" w:color="000000"/>
               <w:left w:val="single" w:sz="2" w:space="0" w:color="000000"/>
@@ -9261,8 +9757,10 @@
         <w:gridCol w:w="1210"/>
         <w:gridCol w:w="1685"/>
         <w:gridCol w:w="3573"/>
-        <w:gridCol w:w="2068"/>
-        <w:gridCol w:w="3005"/>
+        <w:gridCol w:w="1268"/>
+        <w:gridCol w:w="1268"/>
+        <w:gridCol w:w="1268"/>
+        <w:gridCol w:w="1269"/>
         <w:gridCol w:w="2319"/>
       </w:tblGrid>
       <w:tr>
@@ -9368,7 +9866,7 @@
         <w:tc>
           <w:tcPr>
             <w:tcW w:w="5073" w:type="dxa"/>
-            <w:gridSpan w:val="2"/>
+            <w:gridSpan w:val="4"/>
             <w:tcBorders>
               <w:top w:val="single" w:sz="2" w:space="0" w:color="000000"/>
               <w:left w:val="single" w:sz="2" w:space="0" w:color="000000"/>
@@ -9509,7 +10007,7 @@
         </w:tc>
         <w:tc>
           <w:tcPr>
-            <w:tcW w:w="2068" w:type="dxa"/>
+            <w:tcW w:w="1268" w:type="dxa"/>
             <w:tcBorders>
               <w:top w:val="single" w:sz="2" w:space="0" w:color="000000"/>
               <w:left w:val="single" w:sz="2" w:space="0" w:color="000000"/>
@@ -9537,13 +10035,13 @@
                 <w:bCs/>
                 <w:sz w:val="26"/>
               </w:rPr>
-              <w:t>Qualification Stage</w:t>
-            </w:r>
-          </w:p>
-        </w:tc>
-        <w:tc>
-          <w:tcPr>
-            <w:tcW w:w="3005" w:type="dxa"/>
+              <w:t xml:space="preserve">DQ</w:t>
+            </w:r>
+          </w:p>
+        </w:tc>
+        <w:tc>
+          <w:tcPr>
+            <w:tcW w:w="1268" w:type="dxa"/>
             <w:tcBorders>
               <w:top w:val="single" w:sz="2" w:space="0" w:color="000000"/>
               <w:left w:val="single" w:sz="2" w:space="0" w:color="000000"/>
@@ -9571,7 +10069,75 @@
                 <w:bCs/>
                 <w:sz w:val="26"/>
               </w:rPr>
-              <w:t>Section</w:t>
+              <w:t xml:space="preserve">IQ</w:t>
+            </w:r>
+          </w:p>
+        </w:tc>
+        <w:tc>
+          <w:tcPr>
+            <w:tcW w:w="1268" w:type="dxa"/>
+            <w:tcBorders>
+              <w:top w:val="single" w:sz="2" w:space="0" w:color="000000"/>
+              <w:left w:val="single" w:sz="2" w:space="0" w:color="000000"/>
+              <w:bottom w:val="single" w:sz="2" w:space="0" w:color="000000"/>
+              <w:right w:val="single" w:sz="2" w:space="0" w:color="000000"/>
+            </w:tcBorders>
+            <w:shd w:val="clear" w:color="auto" w:fill="FFD966"/>
+            <w:vAlign w:val="center"/>
+          </w:tcPr>
+          <w:p>
+            <w:pPr>
+              <w:ind w:right="51"/>
+              <w:jc w:val="center"/>
+              <w:rPr>
+                <w:rFonts w:ascii="Times New Roman" w:eastAsia="Times New Roman" w:hAnsi="Times New Roman" w:cs="Times New Roman"/>
+                <w:b/>
+                <w:bCs/>
+                <w:sz w:val="26"/>
+              </w:rPr>
+            </w:pPr>
+            <w:r>
+              <w:rPr>
+                <w:rFonts w:ascii="Times New Roman" w:eastAsia="Times New Roman" w:hAnsi="Times New Roman" w:cs="Times New Roman"/>
+                <w:b/>
+                <w:bCs/>
+                <w:sz w:val="26"/>
+              </w:rPr>
+              <w:t xml:space="preserve">OQ</w:t>
+            </w:r>
+          </w:p>
+        </w:tc>
+        <w:tc>
+          <w:tcPr>
+            <w:tcW w:w="1269" w:type="dxa"/>
+            <w:tcBorders>
+              <w:top w:val="single" w:sz="2" w:space="0" w:color="000000"/>
+              <w:left w:val="single" w:sz="2" w:space="0" w:color="000000"/>
+              <w:bottom w:val="single" w:sz="2" w:space="0" w:color="000000"/>
+              <w:right w:val="single" w:sz="2" w:space="0" w:color="000000"/>
+            </w:tcBorders>
+            <w:shd w:val="clear" w:color="auto" w:fill="FFD966"/>
+            <w:vAlign w:val="center"/>
+          </w:tcPr>
+          <w:p>
+            <w:pPr>
+              <w:ind w:right="51"/>
+              <w:jc w:val="center"/>
+              <w:rPr>
+                <w:rFonts w:ascii="Times New Roman" w:eastAsia="Times New Roman" w:hAnsi="Times New Roman" w:cs="Times New Roman"/>
+                <w:b/>
+                <w:bCs/>
+                <w:sz w:val="26"/>
+              </w:rPr>
+            </w:pPr>
+            <w:r>
+              <w:rPr>
+                <w:rFonts w:ascii="Times New Roman" w:eastAsia="Times New Roman" w:hAnsi="Times New Roman" w:cs="Times New Roman"/>
+                <w:b/>
+                <w:bCs/>
+                <w:sz w:val="26"/>
+              </w:rPr>
+              <w:t xml:space="preserve">PQ</w:t>
             </w:r>
           </w:p>
         </w:tc>
@@ -9680,7 +10246,7 @@
         </w:tc>
         <w:tc>
           <w:tcPr>
-            <w:tcW w:w="2068" w:type="dxa"/>
+            <w:tcW w:w="1268" w:type="dxa"/>
             <w:tcBorders>
               <w:top w:val="single" w:sz="2" w:space="0" w:color="000000"/>
               <w:left w:val="single" w:sz="2" w:space="0" w:color="000000"/>
@@ -9709,7 +10275,65 @@
         </w:tc>
         <w:tc>
           <w:tcPr>
-            <w:tcW w:w="3005" w:type="dxa"/>
+            <w:tcW w:w="1268" w:type="dxa"/>
+            <w:tcBorders>
+              <w:top w:val="single" w:sz="2" w:space="0" w:color="000000"/>
+              <w:left w:val="single" w:sz="2" w:space="0" w:color="000000"/>
+              <w:bottom w:val="single" w:sz="2" w:space="0" w:color="000000"/>
+              <w:right w:val="single" w:sz="2" w:space="0" w:color="000000"/>
+            </w:tcBorders>
+            <w:vAlign w:val="center"/>
+          </w:tcPr>
+          <w:p>
+            <w:pPr>
+              <w:ind w:left="23"/>
+              <w:jc w:val="center"/>
+              <w:rPr>
+                <w:rFonts w:ascii="Times New Roman" w:eastAsia="Times New Roman" w:hAnsi="Times New Roman" w:cs="Times New Roman"/>
+                <w:sz w:val="24"/>
+              </w:rPr>
+            </w:pPr>
+            <w:r>
+              <w:rPr>
+                <w:rFonts w:ascii="Times New Roman" w:eastAsia="Times New Roman" w:hAnsi="Times New Roman" w:cs="Times New Roman"/>
+                <w:sz w:val="24"/>
+              </w:rPr>
+              <w:t xml:space="preserve"/>
+            </w:r>
+          </w:p>
+        </w:tc>
+        <w:tc>
+          <w:tcPr>
+            <w:tcW w:w="1268" w:type="dxa"/>
+            <w:tcBorders>
+              <w:top w:val="single" w:sz="2" w:space="0" w:color="000000"/>
+              <w:left w:val="single" w:sz="2" w:space="0" w:color="000000"/>
+              <w:bottom w:val="single" w:sz="2" w:space="0" w:color="000000"/>
+              <w:right w:val="single" w:sz="2" w:space="0" w:color="000000"/>
+            </w:tcBorders>
+            <w:vAlign w:val="center"/>
+          </w:tcPr>
+          <w:p>
+            <w:pPr>
+              <w:ind w:left="23"/>
+              <w:jc w:val="center"/>
+              <w:rPr>
+                <w:rFonts w:ascii="Times New Roman" w:eastAsia="Times New Roman" w:hAnsi="Times New Roman" w:cs="Times New Roman"/>
+                <w:sz w:val="24"/>
+              </w:rPr>
+            </w:pPr>
+            <w:r>
+              <w:rPr>
+                <w:rFonts w:ascii="Times New Roman" w:eastAsia="Times New Roman" w:hAnsi="Times New Roman" w:cs="Times New Roman"/>
+                <w:sz w:val="24"/>
+              </w:rPr>
+              <w:t xml:space="preserve"/>
+            </w:r>
+          </w:p>
+        </w:tc>
+        <w:tc>
+          <w:tcPr>
+            <w:tcW w:w="1269" w:type="dxa"/>
             <w:tcBorders>
               <w:top w:val="single" w:sz="2" w:space="0" w:color="000000"/>
               <w:left w:val="single" w:sz="2" w:space="0" w:color="000000"/>
@@ -9850,8 +10474,10 @@
         <w:gridCol w:w="1210"/>
         <w:gridCol w:w="1685"/>
         <w:gridCol w:w="3573"/>
-        <w:gridCol w:w="2068"/>
-        <w:gridCol w:w="3005"/>
+        <w:gridCol w:w="1268"/>
+        <w:gridCol w:w="1268"/>
+        <w:gridCol w:w="1268"/>
+        <w:gridCol w:w="1269"/>
         <w:gridCol w:w="2319"/>
       </w:tblGrid>
       <w:tr>
@@ -9958,7 +10584,7 @@
         <w:tc>
           <w:tcPr>
             <w:tcW w:w="5073" w:type="dxa"/>
-            <w:gridSpan w:val="2"/>
+            <w:gridSpan w:val="4"/>
             <w:tcBorders>
               <w:top w:val="single" w:sz="2" w:space="0" w:color="000000"/>
               <w:left w:val="single" w:sz="2" w:space="0" w:color="000000"/>
@@ -10099,7 +10725,7 @@
         </w:tc>
         <w:tc>
           <w:tcPr>
-            <w:tcW w:w="2068" w:type="dxa"/>
+            <w:tcW w:w="1268" w:type="dxa"/>
             <w:tcBorders>
               <w:top w:val="single" w:sz="2" w:space="0" w:color="000000"/>
               <w:left w:val="single" w:sz="2" w:space="0" w:color="000000"/>
@@ -10127,13 +10753,13 @@
                 <w:bCs/>
                 <w:sz w:val="26"/>
               </w:rPr>
-              <w:t>Qualification Stage</w:t>
-            </w:r>
-          </w:p>
-        </w:tc>
-        <w:tc>
-          <w:tcPr>
-            <w:tcW w:w="3005" w:type="dxa"/>
+              <w:t xml:space="preserve">DQ</w:t>
+            </w:r>
+          </w:p>
+        </w:tc>
+        <w:tc>
+          <w:tcPr>
+            <w:tcW w:w="1268" w:type="dxa"/>
             <w:tcBorders>
               <w:top w:val="single" w:sz="2" w:space="0" w:color="000000"/>
               <w:left w:val="single" w:sz="2" w:space="0" w:color="000000"/>
@@ -10161,7 +10787,75 @@
                 <w:bCs/>
                 <w:sz w:val="26"/>
               </w:rPr>
-              <w:t>Section</w:t>
+              <w:t xml:space="preserve">IQ</w:t>
+            </w:r>
+          </w:p>
+        </w:tc>
+        <w:tc>
+          <w:tcPr>
+            <w:tcW w:w="1268" w:type="dxa"/>
+            <w:tcBorders>
+              <w:top w:val="single" w:sz="2" w:space="0" w:color="000000"/>
+              <w:left w:val="single" w:sz="2" w:space="0" w:color="000000"/>
+              <w:bottom w:val="single" w:sz="2" w:space="0" w:color="000000"/>
+              <w:right w:val="single" w:sz="2" w:space="0" w:color="000000"/>
+            </w:tcBorders>
+            <w:shd w:val="clear" w:color="auto" w:fill="FFD966"/>
+            <w:vAlign w:val="center"/>
+          </w:tcPr>
+          <w:p>
+            <w:pPr>
+              <w:ind w:right="51"/>
+              <w:jc w:val="center"/>
+              <w:rPr>
+                <w:rFonts w:ascii="Times New Roman" w:eastAsia="Times New Roman" w:hAnsi="Times New Roman" w:cs="Times New Roman"/>
+                <w:b/>
+                <w:bCs/>
+                <w:sz w:val="26"/>
+              </w:rPr>
+            </w:pPr>
+            <w:r>
+              <w:rPr>
+                <w:rFonts w:ascii="Times New Roman" w:eastAsia="Times New Roman" w:hAnsi="Times New Roman" w:cs="Times New Roman"/>
+                <w:b/>
+                <w:bCs/>
+                <w:sz w:val="26"/>
+              </w:rPr>
+              <w:t xml:space="preserve">OQ</w:t>
+            </w:r>
+          </w:p>
+        </w:tc>
+        <w:tc>
+          <w:tcPr>
+            <w:tcW w:w="1269" w:type="dxa"/>
+            <w:tcBorders>
+              <w:top w:val="single" w:sz="2" w:space="0" w:color="000000"/>
+              <w:left w:val="single" w:sz="2" w:space="0" w:color="000000"/>
+              <w:bottom w:val="single" w:sz="2" w:space="0" w:color="000000"/>
+              <w:right w:val="single" w:sz="2" w:space="0" w:color="000000"/>
+            </w:tcBorders>
+            <w:shd w:val="clear" w:color="auto" w:fill="FFD966"/>
+            <w:vAlign w:val="center"/>
+          </w:tcPr>
+          <w:p>
+            <w:pPr>
+              <w:ind w:right="51"/>
+              <w:jc w:val="center"/>
+              <w:rPr>
+                <w:rFonts w:ascii="Times New Roman" w:eastAsia="Times New Roman" w:hAnsi="Times New Roman" w:cs="Times New Roman"/>
+                <w:b/>
+                <w:bCs/>
+                <w:sz w:val="26"/>
+              </w:rPr>
+            </w:pPr>
+            <w:r>
+              <w:rPr>
+                <w:rFonts w:ascii="Times New Roman" w:eastAsia="Times New Roman" w:hAnsi="Times New Roman" w:cs="Times New Roman"/>
+                <w:b/>
+                <w:bCs/>
+                <w:sz w:val="26"/>
+              </w:rPr>
+              <w:t xml:space="preserve">PQ</w:t>
             </w:r>
           </w:p>
         </w:tc>
@@ -10270,7 +10964,7 @@
         </w:tc>
         <w:tc>
           <w:tcPr>
-            <w:tcW w:w="2068" w:type="dxa"/>
+            <w:tcW w:w="1268" w:type="dxa"/>
             <w:tcBorders>
               <w:top w:val="single" w:sz="2" w:space="0" w:color="000000"/>
               <w:left w:val="single" w:sz="2" w:space="0" w:color="000000"/>
@@ -10297,7 +10991,61 @@
         </w:tc>
         <w:tc>
           <w:tcPr>
-            <w:tcW w:w="3005" w:type="dxa"/>
+            <w:tcW w:w="1268" w:type="dxa"/>
+            <w:tcBorders>
+              <w:top w:val="single" w:sz="2" w:space="0" w:color="000000"/>
+              <w:left w:val="single" w:sz="2" w:space="0" w:color="000000"/>
+              <w:bottom w:val="single" w:sz="2" w:space="0" w:color="000000"/>
+              <w:right w:val="single" w:sz="2" w:space="0" w:color="000000"/>
+            </w:tcBorders>
+          </w:tcPr>
+          <w:p>
+            <w:pPr>
+              <w:ind w:left="23"/>
+              <w:rPr>
+                <w:rFonts w:ascii="Times New Roman" w:eastAsia="Times New Roman" w:hAnsi="Times New Roman" w:cs="Times New Roman"/>
+                <w:sz w:val="24"/>
+              </w:rPr>
+            </w:pPr>
+            <w:r>
+              <w:rPr>
+                <w:rFonts w:ascii="Times New Roman" w:eastAsia="Times New Roman" w:hAnsi="Times New Roman" w:cs="Times New Roman"/>
+                <w:sz w:val="24"/>
+              </w:rPr>
+              <w:t xml:space="preserve"/>
+            </w:r>
+          </w:p>
+        </w:tc>
+        <w:tc>
+          <w:tcPr>
+            <w:tcW w:w="1268" w:type="dxa"/>
+            <w:tcBorders>
+              <w:top w:val="single" w:sz="2" w:space="0" w:color="000000"/>
+              <w:left w:val="single" w:sz="2" w:space="0" w:color="000000"/>
+              <w:bottom w:val="single" w:sz="2" w:space="0" w:color="000000"/>
+              <w:right w:val="single" w:sz="2" w:space="0" w:color="000000"/>
+            </w:tcBorders>
+          </w:tcPr>
+          <w:p>
+            <w:pPr>
+              <w:ind w:left="23"/>
+              <w:rPr>
+                <w:rFonts w:ascii="Times New Roman" w:eastAsia="Times New Roman" w:hAnsi="Times New Roman" w:cs="Times New Roman"/>
+                <w:sz w:val="24"/>
+              </w:rPr>
+            </w:pPr>
+            <w:r>
+              <w:rPr>
+                <w:rFonts w:ascii="Times New Roman" w:eastAsia="Times New Roman" w:hAnsi="Times New Roman" w:cs="Times New Roman"/>
+                <w:sz w:val="24"/>
+              </w:rPr>
+              <w:t xml:space="preserve"/>
+            </w:r>
+          </w:p>
+        </w:tc>
+        <w:tc>
+          <w:tcPr>
+            <w:tcW w:w="1269" w:type="dxa"/>
             <w:tcBorders>
               <w:top w:val="single" w:sz="2" w:space="0" w:color="000000"/>
               <w:left w:val="single" w:sz="2" w:space="0" w:color="000000"/>

</xml_diff>